<commit_message>
Add/update resource data for FIAKeyTerms
</commit_message>
<xml_diff>
--- a/eng/docx/001.content.docx
+++ b/eng/docx/001.content.docx
@@ -19,7 +19,7 @@
         <w:rPr>
           <w:lang w:val="en_US" w:bidi="en_US"/>
         </w:rPr>
-        <w:t>Resource: Key Terms (SRV)</w:t>
+        <w:t>Resource: Key Terms (FIA)</w:t>
       </w:r>
       <w:r>
         <w:rPr>
@@ -90,7 +90,7 @@
         <w:rPr>
           <w:lang w:val="en_US" w:bidi="en_US"/>
         </w:rPr>
-        <w:t>Key Terms (SRV)</w:t>
+        <w:t>Key Terms (FIA)</w:t>
       </w:r>
     </w:p>
     <w:p>
@@ -144,26 +144,6 @@
       </w:r>
       <w:r>
         <w:rPr>
-          <w:i/>
-          <w:lang w:val="en_US" w:bidi="en_US"/>
-        </w:rPr>
-        <w:t>abba, abba, Abraham, Abraham, adonai, adonai, adultery, adultery, altar, altar, amen, amen, angel, angel, angel of the Lord, angel of the Lord, anoint, anoint, apostle, apostle, authority, authority</w:t>
-      </w:r>
-      <w:r>
-        <w:rPr>
-          <w:lang w:val="en_US" w:bidi="en_US"/>
-        </w:rPr>
-      </w:r>
-    </w:p>
-    <w:p>
-      <w:pPr/>
-      <w:r>
-        <w:rPr>
-          <w:lang w:val="en_US" w:bidi="en_US"/>
-        </w:rPr>
-      </w:r>
-      <w:r>
-        <w:rPr>
           <w:lang w:val="en_US" w:bidi="en_US"/>
         </w:rPr>
         <w:t xml:space="preserve"> </w:t>
@@ -236,7 +216,31 @@
         <w:rPr>
           <w:lang w:val="en_US" w:bidi="en_US"/>
         </w:rPr>
-        <w:t xml:space="preserve"> is the Aramaic word for "father." Aramaic was the language that the people in Israel spoke in Jesus's time. Jesus calls God "abba" when he prays to God just before he was arrested and then </w:t>
+        <w:t xml:space="preserve"> is the Aramaic word for "father." Aramaic was the language that the people in </w:t>
+      </w:r>
+      <w:r>
+        <w:rPr>
+          <w:lang w:val="en_US" w:bidi="en_US"/>
+        </w:rPr>
+        <w:t>Israel</w:t>
+      </w:r>
+      <w:r>
+        <w:rPr>
+          <w:lang w:val="en_US" w:bidi="en_US"/>
+        </w:rPr>
+        <w:t xml:space="preserve"> spoke in Jesus's time. Jesus calls God "abba" when he </w:t>
+      </w:r>
+      <w:r>
+        <w:rPr>
+          <w:lang w:val="en_US" w:bidi="en_US"/>
+        </w:rPr>
+        <w:t>prays</w:t>
+      </w:r>
+      <w:r>
+        <w:rPr>
+          <w:lang w:val="en_US" w:bidi="en_US"/>
+        </w:rPr>
+        <w:t xml:space="preserve"> to God just before he was arrested and then </w:t>
       </w:r>
       <w:r>
         <w:rPr>
@@ -312,6 +316,68 @@
           <w:lang w:val="en_US" w:bidi="en_US"/>
         </w:rPr>
       </w:r>
+    </w:p>
+    <w:p>
+      <w:pPr/>
+      <w:r>
+        <w:rPr>
+          <w:lang w:val="en_US" w:bidi="en_US"/>
+        </w:rPr>
+      </w:r>
+      <w:hyperlink r:id="rId13">
+        <w:r>
+          <w:rPr>
+            <w:lang w:val="en_US" w:bidi="en_US"/>
+          </w:rPr>
+          <w:rPr>
+            <w:color w:val="0000EE"/>
+            <w:u w:val="single"/>
+          </w:rPr>
+          <w:t>webm file</w:t>
+        </w:r>
+      </w:hyperlink>
+      <w:r>
+        <w:rPr>
+          <w:lang w:val="en_US" w:bidi="en_US"/>
+        </w:rPr>
+        <w:t xml:space="preserve"> (304980 KB)</w:t>
+      </w:r>
+      <w:r>
+        <w:rPr>
+          <w:lang w:val="en_US" w:bidi="en_US"/>
+        </w:rPr>
+      </w:r>
+    </w:p>
+    <w:p>
+      <w:pPr/>
+      <w:r>
+        <w:rPr>
+          <w:lang w:val="en_US" w:bidi="en_US"/>
+        </w:rPr>
+      </w:r>
+      <w:hyperlink r:id="rId14">
+        <w:r>
+          <w:rPr>
+            <w:lang w:val="en_US" w:bidi="en_US"/>
+          </w:rPr>
+          <w:rPr>
+            <w:color w:val="0000EE"/>
+            <w:u w:val="single"/>
+          </w:rPr>
+          <w:t>mp3 file</w:t>
+        </w:r>
+      </w:hyperlink>
+      <w:r>
+        <w:rPr>
+          <w:lang w:val="en_US" w:bidi="en_US"/>
+        </w:rPr>
+        <w:t xml:space="preserve"> (391268 KB)</w:t>
+      </w:r>
+      <w:r>
+        <w:rPr>
+          <w:lang w:val="en_US" w:bidi="en_US"/>
+        </w:rPr>
+      </w:r>
       <w:r>
         <w:rPr>
           <w:lang w:val="en_US" w:bidi="en_US"/>
@@ -351,9 +417,16 @@
       </w:r>
       <w:r>
         <w:rPr>
-          <w:lang w:val="en_US" w:bidi="en_US"/>
-        </w:rPr>
-        <w:t xml:space="preserve">Abraham was the first ancestor of the </w:t>
+          <w:b/>
+          <w:lang w:val="en_US" w:bidi="en_US"/>
+        </w:rPr>
+        <w:t>Abraham</w:t>
+      </w:r>
+      <w:r>
+        <w:rPr>
+          <w:lang w:val="en_US" w:bidi="en_US"/>
+        </w:rPr>
+        <w:t xml:space="preserve"> was the first ancestor of the </w:t>
       </w:r>
       <w:r>
         <w:rPr>
@@ -391,7 +464,19 @@
         <w:rPr>
           <w:lang w:val="en_US" w:bidi="en_US"/>
         </w:rPr>
-        <w:t xml:space="preserve">Abraham lived about two thousand years before the birth of Jesus. He first lived in a region named Ur, which was somewhere east of Israel. Abraham's father Terah took his sons and their wives with him and left Ur, because he wanted to go to the country named </w:t>
+        <w:t xml:space="preserve">Abraham lived about two thousand years before the birth of Jesus. He first lived in a region named Ur, which was somewhere east of </w:t>
+      </w:r>
+      <w:r>
+        <w:rPr>
+          <w:lang w:val="en_US" w:bidi="en_US"/>
+        </w:rPr>
+        <w:t>Israel</w:t>
+      </w:r>
+      <w:r>
+        <w:rPr>
+          <w:lang w:val="en_US" w:bidi="en_US"/>
+        </w:rPr>
+        <w:t xml:space="preserve">. Abraham's father Terah took his sons and their wives with him and left Ur, because he wanted to go to the country named </w:t>
       </w:r>
       <w:r>
         <w:rPr>
@@ -403,7 +488,19 @@
         <w:rPr>
           <w:lang w:val="en_US" w:bidi="en_US"/>
         </w:rPr>
-        <w:t xml:space="preserve">, but he stopped in a place called Haran. This was still quite far away from Canaan. The family began to live there, and after some time Abraham's father died. Abraham and his family did not know God; they worshiped </w:t>
+        <w:t xml:space="preserve">, but he stopped in a place called Haran. This was still quite far away from Canaan. The family began to live there, and after some time Abraham's father died. Abraham and his family did not know God; they </w:t>
+      </w:r>
+      <w:r>
+        <w:rPr>
+          <w:lang w:val="en_US" w:bidi="en_US"/>
+        </w:rPr>
+        <w:t>worshiped</w:t>
+      </w:r>
+      <w:r>
+        <w:rPr>
+          <w:lang w:val="en_US" w:bidi="en_US"/>
+        </w:rPr>
+        <w:t xml:space="preserve"> </w:t>
       </w:r>
       <w:r>
         <w:rPr>
@@ -479,7 +576,19 @@
         <w:rPr>
           <w:lang w:val="en_US" w:bidi="en_US"/>
         </w:rPr>
-        <w:t>However, Abraham did not have any descendants yet. He had no children, and he was already an old man! But he believed God's promise. And God was very pleased with Abraham's trust, and therefore he accepted Abraham as someone with whom God could have a good relationship.</w:t>
+        <w:t xml:space="preserve">However, Abraham did not have any descendants yet. He had no children, and he was already an old man! But he </w:t>
+      </w:r>
+      <w:r>
+        <w:rPr>
+          <w:lang w:val="en_US" w:bidi="en_US"/>
+        </w:rPr>
+        <w:t>believed</w:t>
+      </w:r>
+      <w:r>
+        <w:rPr>
+          <w:lang w:val="en_US" w:bidi="en_US"/>
+        </w:rPr>
+        <w:t xml:space="preserve"> God's promise. And God was very pleased with Abraham's trust, and therefore he accepted Abraham as someone with whom God could have a good relationship.</w:t>
       </w:r>
     </w:p>
     <w:p>
@@ -573,6 +682,68 @@
           <w:lang w:val="en_US" w:bidi="en_US"/>
         </w:rPr>
       </w:r>
+    </w:p>
+    <w:p>
+      <w:pPr/>
+      <w:r>
+        <w:rPr>
+          <w:lang w:val="en_US" w:bidi="en_US"/>
+        </w:rPr>
+      </w:r>
+      <w:hyperlink r:id="rId15">
+        <w:r>
+          <w:rPr>
+            <w:lang w:val="en_US" w:bidi="en_US"/>
+          </w:rPr>
+          <w:rPr>
+            <w:color w:val="0000EE"/>
+            <w:u w:val="single"/>
+          </w:rPr>
+          <w:t>webm file</w:t>
+        </w:r>
+      </w:hyperlink>
+      <w:r>
+        <w:rPr>
+          <w:lang w:val="en_US" w:bidi="en_US"/>
+        </w:rPr>
+        <w:t xml:space="preserve"> (1871962 KB)</w:t>
+      </w:r>
+      <w:r>
+        <w:rPr>
+          <w:lang w:val="en_US" w:bidi="en_US"/>
+        </w:rPr>
+      </w:r>
+    </w:p>
+    <w:p>
+      <w:pPr/>
+      <w:r>
+        <w:rPr>
+          <w:lang w:val="en_US" w:bidi="en_US"/>
+        </w:rPr>
+      </w:r>
+      <w:hyperlink r:id="rId16">
+        <w:r>
+          <w:rPr>
+            <w:lang w:val="en_US" w:bidi="en_US"/>
+          </w:rPr>
+          <w:rPr>
+            <w:color w:val="0000EE"/>
+            <w:u w:val="single"/>
+          </w:rPr>
+          <w:t>mp3 file</w:t>
+        </w:r>
+      </w:hyperlink>
+      <w:r>
+        <w:rPr>
+          <w:lang w:val="en_US" w:bidi="en_US"/>
+        </w:rPr>
+        <w:t xml:space="preserve"> (2502188 KB)</w:t>
+      </w:r>
+      <w:r>
+        <w:rPr>
+          <w:lang w:val="en_US" w:bidi="en_US"/>
+        </w:rPr>
+      </w:r>
       <w:r>
         <w:rPr>
           <w:lang w:val="en_US" w:bidi="en_US"/>
@@ -691,6 +862,68 @@
           <w:lang w:val="en_US" w:bidi="en_US"/>
         </w:rPr>
       </w:r>
+    </w:p>
+    <w:p>
+      <w:pPr/>
+      <w:r>
+        <w:rPr>
+          <w:lang w:val="en_US" w:bidi="en_US"/>
+        </w:rPr>
+      </w:r>
+      <w:hyperlink r:id="rId17">
+        <w:r>
+          <w:rPr>
+            <w:lang w:val="en_US" w:bidi="en_US"/>
+          </w:rPr>
+          <w:rPr>
+            <w:color w:val="0000EE"/>
+            <w:u w:val="single"/>
+          </w:rPr>
+          <w:t>webm file</w:t>
+        </w:r>
+      </w:hyperlink>
+      <w:r>
+        <w:rPr>
+          <w:lang w:val="en_US" w:bidi="en_US"/>
+        </w:rPr>
+        <w:t xml:space="preserve"> (167144 KB)</w:t>
+      </w:r>
+      <w:r>
+        <w:rPr>
+          <w:lang w:val="en_US" w:bidi="en_US"/>
+        </w:rPr>
+      </w:r>
+    </w:p>
+    <w:p>
+      <w:pPr/>
+      <w:r>
+        <w:rPr>
+          <w:lang w:val="en_US" w:bidi="en_US"/>
+        </w:rPr>
+      </w:r>
+      <w:hyperlink r:id="rId18">
+        <w:r>
+          <w:rPr>
+            <w:lang w:val="en_US" w:bidi="en_US"/>
+          </w:rPr>
+          <w:rPr>
+            <w:color w:val="0000EE"/>
+            <w:u w:val="single"/>
+          </w:rPr>
+          <w:t>mp3 file</w:t>
+        </w:r>
+      </w:hyperlink>
+      <w:r>
+        <w:rPr>
+          <w:lang w:val="en_US" w:bidi="en_US"/>
+        </w:rPr>
+        <w:t xml:space="preserve"> (223100 KB)</w:t>
+      </w:r>
+      <w:r>
+        <w:rPr>
+          <w:lang w:val="en_US" w:bidi="en_US"/>
+        </w:rPr>
+      </w:r>
       <w:r>
         <w:rPr>
           <w:lang w:val="en_US" w:bidi="en_US"/>
@@ -894,6 +1127,68 @@
           <w:lang w:val="en_US" w:bidi="en_US"/>
         </w:rPr>
       </w:r>
+    </w:p>
+    <w:p>
+      <w:pPr/>
+      <w:r>
+        <w:rPr>
+          <w:lang w:val="en_US" w:bidi="en_US"/>
+        </w:rPr>
+      </w:r>
+      <w:hyperlink r:id="rId19">
+        <w:r>
+          <w:rPr>
+            <w:lang w:val="en_US" w:bidi="en_US"/>
+          </w:rPr>
+          <w:rPr>
+            <w:color w:val="0000EE"/>
+            <w:u w:val="single"/>
+          </w:rPr>
+          <w:t>webm file</w:t>
+        </w:r>
+      </w:hyperlink>
+      <w:r>
+        <w:rPr>
+          <w:lang w:val="en_US" w:bidi="en_US"/>
+        </w:rPr>
+        <w:t xml:space="preserve"> (883896 KB)</w:t>
+      </w:r>
+      <w:r>
+        <w:rPr>
+          <w:lang w:val="en_US" w:bidi="en_US"/>
+        </w:rPr>
+      </w:r>
+    </w:p>
+    <w:p>
+      <w:pPr/>
+      <w:r>
+        <w:rPr>
+          <w:lang w:val="en_US" w:bidi="en_US"/>
+        </w:rPr>
+      </w:r>
+      <w:hyperlink r:id="rId20">
+        <w:r>
+          <w:rPr>
+            <w:lang w:val="en_US" w:bidi="en_US"/>
+          </w:rPr>
+          <w:rPr>
+            <w:color w:val="0000EE"/>
+            <w:u w:val="single"/>
+          </w:rPr>
+          <w:t>mp3 file</w:t>
+        </w:r>
+      </w:hyperlink>
+      <w:r>
+        <w:rPr>
+          <w:lang w:val="en_US" w:bidi="en_US"/>
+        </w:rPr>
+        <w:t xml:space="preserve"> (1129196 KB)</w:t>
+      </w:r>
+      <w:r>
+        <w:rPr>
+          <w:lang w:val="en_US" w:bidi="en_US"/>
+        </w:rPr>
+      </w:r>
       <w:r>
         <w:rPr>
           <w:lang w:val="en_US" w:bidi="en_US"/>
@@ -916,6 +1211,188 @@
         <w:rPr>
           <w:lang w:val="en_US" w:bidi="en_US"/>
         </w:rPr>
+        <w:t>advocate</w:t>
+      </w:r>
+      <w:r>
+        <w:rPr>
+          <w:lang w:val="en_US" w:bidi="en_US"/>
+        </w:rPr>
+      </w:r>
+    </w:p>
+    <w:p>
+      <w:pPr/>
+      <w:r>
+        <w:rPr>
+          <w:lang w:val="en_US" w:bidi="en_US"/>
+        </w:rPr>
+      </w:r>
+      <w:r>
+        <w:rPr>
+          <w:lang w:val="en_US" w:bidi="en_US"/>
+        </w:rPr>
+        <w:t xml:space="preserve">An </w:t>
+      </w:r>
+      <w:r>
+        <w:rPr>
+          <w:b/>
+          <w:lang w:val="en_US" w:bidi="en_US"/>
+        </w:rPr>
+        <w:t>advocate</w:t>
+      </w:r>
+      <w:r>
+        <w:rPr>
+          <w:lang w:val="en_US" w:bidi="en_US"/>
+        </w:rPr>
+        <w:t xml:space="preserve"> is someone who speaks on behalf of another person. An advocate wants people to help a person or group of people in trouble and to treat that person or group of people fairly. For example, if someone speaks to the government of the country and asks if the government can do more to help the poor people, he is advocating for the poor people.</w:t>
+      </w:r>
+    </w:p>
+    <w:p>
+      <w:pPr/>
+      <w:r>
+        <w:rPr>
+          <w:lang w:val="en_US" w:bidi="en_US"/>
+        </w:rPr>
+      </w:r>
+      <w:r>
+        <w:rPr>
+          <w:lang w:val="en_US" w:bidi="en_US"/>
+        </w:rPr>
+        <w:t>In a court case, an advocate defends the person who people have accused of doing a crime. The advocate may say to the judge that the person is innocent and doesn't deserve punishment, or the advocate may tell the court that the person is really sorry for what he has done, or that he didn't mean to do it. An advocate tries to get the judge to give only a very mild punishment, or to give no punishment at all.</w:t>
+      </w:r>
+      <w:r>
+        <w:rPr>
+          <w:lang w:val="en_US" w:bidi="en_US"/>
+        </w:rPr>
+      </w:r>
+      <w:r>
+        <w:rPr>
+          <w:lang w:val="en_US" w:bidi="en_US"/>
+        </w:rPr>
+      </w:r>
+    </w:p>
+    <w:p>
+      <w:pPr/>
+      <w:r>
+        <w:rPr>
+          <w:lang w:val="en_US" w:bidi="en_US"/>
+        </w:rPr>
+      </w:r>
+    </w:p>
+    <w:p>
+      <w:pPr>
+        <w:pStyle w:val="Heading2"/>
+      </w:pPr>
+      <w:r>
+        <w:rPr>
+          <w:lang w:val="en_US" w:bidi="en_US"/>
+        </w:rPr>
+        <w:t>advocate</w:t>
+      </w:r>
+      <w:r>
+        <w:rPr>
+          <w:lang w:val="en_US" w:bidi="en_US"/>
+        </w:rPr>
+      </w:r>
+    </w:p>
+    <w:p>
+      <w:pPr>
+        <w:pStyle w:val="Heading4"/>
+      </w:pPr>
+      <w:r>
+        <w:rPr>
+          <w:lang w:val="en_US" w:bidi="en_US"/>
+        </w:rPr>
+        <w:t>Audio Content</w:t>
+      </w:r>
+      <w:r>
+        <w:rPr>
+          <w:lang w:val="en_US" w:bidi="en_US"/>
+        </w:rPr>
+      </w:r>
+    </w:p>
+    <w:p>
+      <w:pPr/>
+      <w:r>
+        <w:rPr>
+          <w:lang w:val="en_US" w:bidi="en_US"/>
+        </w:rPr>
+      </w:r>
+      <w:hyperlink r:id="rId21">
+        <w:r>
+          <w:rPr>
+            <w:lang w:val="en_US" w:bidi="en_US"/>
+          </w:rPr>
+          <w:rPr>
+            <w:color w:val="0000EE"/>
+            <w:u w:val="single"/>
+          </w:rPr>
+          <w:t>webm file</w:t>
+        </w:r>
+      </w:hyperlink>
+      <w:r>
+        <w:rPr>
+          <w:lang w:val="en_US" w:bidi="en_US"/>
+        </w:rPr>
+        <w:t xml:space="preserve"> (514567 KB)</w:t>
+      </w:r>
+      <w:r>
+        <w:rPr>
+          <w:lang w:val="en_US" w:bidi="en_US"/>
+        </w:rPr>
+      </w:r>
+    </w:p>
+    <w:p>
+      <w:pPr/>
+      <w:r>
+        <w:rPr>
+          <w:lang w:val="en_US" w:bidi="en_US"/>
+        </w:rPr>
+      </w:r>
+      <w:hyperlink r:id="rId22">
+        <w:r>
+          <w:rPr>
+            <w:lang w:val="en_US" w:bidi="en_US"/>
+          </w:rPr>
+          <w:rPr>
+            <w:color w:val="0000EE"/>
+            <w:u w:val="single"/>
+          </w:rPr>
+          <w:t>mp3 file</w:t>
+        </w:r>
+      </w:hyperlink>
+      <w:r>
+        <w:rPr>
+          <w:lang w:val="en_US" w:bidi="en_US"/>
+        </w:rPr>
+        <w:t xml:space="preserve"> (666428 KB)</w:t>
+      </w:r>
+      <w:r>
+        <w:rPr>
+          <w:lang w:val="en_US" w:bidi="en_US"/>
+        </w:rPr>
+      </w:r>
+      <w:r>
+        <w:rPr>
+          <w:lang w:val="en_US" w:bidi="en_US"/>
+        </w:rPr>
+      </w:r>
+    </w:p>
+    <w:p>
+      <w:pPr/>
+      <w:r>
+        <w:rPr>
+          <w:lang w:val="en_US" w:bidi="en_US"/>
+        </w:rPr>
+      </w:r>
+    </w:p>
+    <w:p>
+      <w:pPr>
+        <w:pStyle w:val="Heading2"/>
+      </w:pPr>
+      <w:r>
+        <w:rPr>
+          <w:lang w:val="en_US" w:bidi="en_US"/>
+        </w:rPr>
         <w:t>altar</w:t>
       </w:r>
       <w:r>
@@ -1088,6 +1565,68 @@
           <w:lang w:val="en_US" w:bidi="en_US"/>
         </w:rPr>
       </w:r>
+    </w:p>
+    <w:p>
+      <w:pPr/>
+      <w:r>
+        <w:rPr>
+          <w:lang w:val="en_US" w:bidi="en_US"/>
+        </w:rPr>
+      </w:r>
+      <w:hyperlink r:id="rId23">
+        <w:r>
+          <w:rPr>
+            <w:lang w:val="en_US" w:bidi="en_US"/>
+          </w:rPr>
+          <w:rPr>
+            <w:color w:val="0000EE"/>
+            <w:u w:val="single"/>
+          </w:rPr>
+          <w:t>webm file</w:t>
+        </w:r>
+      </w:hyperlink>
+      <w:r>
+        <w:rPr>
+          <w:lang w:val="en_US" w:bidi="en_US"/>
+        </w:rPr>
+        <w:t xml:space="preserve"> (421252 KB)</w:t>
+      </w:r>
+      <w:r>
+        <w:rPr>
+          <w:lang w:val="en_US" w:bidi="en_US"/>
+        </w:rPr>
+      </w:r>
+    </w:p>
+    <w:p>
+      <w:pPr/>
+      <w:r>
+        <w:rPr>
+          <w:lang w:val="en_US" w:bidi="en_US"/>
+        </w:rPr>
+      </w:r>
+      <w:hyperlink r:id="rId24">
+        <w:r>
+          <w:rPr>
+            <w:lang w:val="en_US" w:bidi="en_US"/>
+          </w:rPr>
+          <w:rPr>
+            <w:color w:val="0000EE"/>
+            <w:u w:val="single"/>
+          </w:rPr>
+          <w:t>mp3 file</w:t>
+        </w:r>
+      </w:hyperlink>
+      <w:r>
+        <w:rPr>
+          <w:lang w:val="en_US" w:bidi="en_US"/>
+        </w:rPr>
+        <w:t xml:space="preserve"> (562556 KB)</w:t>
+      </w:r>
+      <w:r>
+        <w:rPr>
+          <w:lang w:val="en_US" w:bidi="en_US"/>
+        </w:rPr>
+      </w:r>
       <w:r>
         <w:rPr>
           <w:lang w:val="en_US" w:bidi="en_US"/>
@@ -1162,21 +1701,33 @@
         <w:rPr>
           <w:lang w:val="en_US" w:bidi="en_US"/>
         </w:rPr>
-        <w:t>When someone tells you that something good is going to happen, you can respond by saying "Amen!" This means that you say that you hope and believe that it will be true.</w:t>
-      </w:r>
-    </w:p>
-    <w:p>
-      <w:pPr/>
-      <w:r>
-        <w:rPr>
-          <w:lang w:val="en_US" w:bidi="en_US"/>
-        </w:rPr>
-      </w:r>
-      <w:r>
-        <w:rPr>
-          <w:lang w:val="en_US" w:bidi="en_US"/>
-        </w:rPr>
-        <w:t xml:space="preserve">When someone offers a prayer to God, you can say "Amen." This means that you hope and believe that the </w:t>
+        <w:t xml:space="preserve">When someone tells you that something good is going to happen, you can respond by saying "Amen!" This means that you say that you hope and </w:t>
+      </w:r>
+      <w:r>
+        <w:rPr>
+          <w:lang w:val="en_US" w:bidi="en_US"/>
+        </w:rPr>
+        <w:t>believe</w:t>
+      </w:r>
+      <w:r>
+        <w:rPr>
+          <w:lang w:val="en_US" w:bidi="en_US"/>
+        </w:rPr>
+        <w:t xml:space="preserve"> that it will be true.</w:t>
+      </w:r>
+    </w:p>
+    <w:p>
+      <w:pPr/>
+      <w:r>
+        <w:rPr>
+          <w:lang w:val="en_US" w:bidi="en_US"/>
+        </w:rPr>
+      </w:r>
+      <w:r>
+        <w:rPr>
+          <w:lang w:val="en_US" w:bidi="en_US"/>
+        </w:rPr>
+        <w:t xml:space="preserve">When someone offers a </w:t>
       </w:r>
       <w:r>
         <w:rPr>
@@ -1188,7 +1739,7 @@
         <w:rPr>
           <w:lang w:val="en_US" w:bidi="en_US"/>
         </w:rPr>
-        <w:t xml:space="preserve"> will be answered.</w:t>
+        <w:t xml:space="preserve"> to God, you can say "Amen." This means that you hope and believe that the prayer will be answered.</w:t>
       </w:r>
     </w:p>
     <w:p>
@@ -1254,6 +1805,68 @@
           <w:lang w:val="en_US" w:bidi="en_US"/>
         </w:rPr>
       </w:r>
+    </w:p>
+    <w:p>
+      <w:pPr/>
+      <w:r>
+        <w:rPr>
+          <w:lang w:val="en_US" w:bidi="en_US"/>
+        </w:rPr>
+      </w:r>
+      <w:hyperlink r:id="rId25">
+        <w:r>
+          <w:rPr>
+            <w:lang w:val="en_US" w:bidi="en_US"/>
+          </w:rPr>
+          <w:rPr>
+            <w:color w:val="0000EE"/>
+            <w:u w:val="single"/>
+          </w:rPr>
+          <w:t>webm file</w:t>
+        </w:r>
+      </w:hyperlink>
+      <w:r>
+        <w:rPr>
+          <w:lang w:val="en_US" w:bidi="en_US"/>
+        </w:rPr>
+        <w:t xml:space="preserve"> (446072 KB)</w:t>
+      </w:r>
+      <w:r>
+        <w:rPr>
+          <w:lang w:val="en_US" w:bidi="en_US"/>
+        </w:rPr>
+      </w:r>
+    </w:p>
+    <w:p>
+      <w:pPr/>
+      <w:r>
+        <w:rPr>
+          <w:lang w:val="en_US" w:bidi="en_US"/>
+        </w:rPr>
+      </w:r>
+      <w:hyperlink r:id="rId26">
+        <w:r>
+          <w:rPr>
+            <w:lang w:val="en_US" w:bidi="en_US"/>
+          </w:rPr>
+          <w:rPr>
+            <w:color w:val="0000EE"/>
+            <w:u w:val="single"/>
+          </w:rPr>
+          <w:t>mp3 file</w:t>
+        </w:r>
+      </w:hyperlink>
+      <w:r>
+        <w:rPr>
+          <w:lang w:val="en_US" w:bidi="en_US"/>
+        </w:rPr>
+        <w:t xml:space="preserve"> (582548 KB)</w:t>
+      </w:r>
+      <w:r>
+        <w:rPr>
+          <w:lang w:val="en_US" w:bidi="en_US"/>
+        </w:rPr>
+      </w:r>
       <w:r>
         <w:rPr>
           <w:lang w:val="en_US" w:bidi="en_US"/>
@@ -1308,7 +1921,19 @@
         <w:rPr>
           <w:lang w:val="en_US" w:bidi="en_US"/>
         </w:rPr>
-        <w:t xml:space="preserve"> is a supernatural, spiritual being created by God. Angels give messages from God to people; for instance, an angel told Mary that she would be pregnant through the power of God. Sometimes an angel gives a message to people in a dream; for instance, an angel told Joseph in a dream to take Mary and Jesus and flee to Egypt.</w:t>
+        <w:t xml:space="preserve"> is a supernatural, spiritual being created by God. Angels give messages from God to people; for instance, an angel told </w:t>
+      </w:r>
+      <w:r>
+        <w:rPr>
+          <w:lang w:val="en_US" w:bidi="en_US"/>
+        </w:rPr>
+        <w:t>Mary</w:t>
+      </w:r>
+      <w:r>
+        <w:rPr>
+          <w:lang w:val="en_US" w:bidi="en_US"/>
+        </w:rPr>
+        <w:t xml:space="preserve"> that she would be pregnant through the power of God. Sometimes an angel gives a message to people in a dream; for instance, an angel told Joseph in a dream to take Mary and Jesus and flee to Egypt.</w:t>
       </w:r>
     </w:p>
     <w:p>
@@ -1362,7 +1987,19 @@
         <w:rPr>
           <w:lang w:val="en_US" w:bidi="en_US"/>
         </w:rPr>
-        <w:t>God also uses angels to give punishments to people. For instance, an angel killed the firstborn sons in Egypt after the king refused to let the Israelites leave. From the New Testament we know that God will use angels for his final judgment.</w:t>
+        <w:t xml:space="preserve">God also uses angels to give punishments to people. For instance, an angel killed the firstborn sons in Egypt after the king refused to let the </w:t>
+      </w:r>
+      <w:r>
+        <w:rPr>
+          <w:lang w:val="en_US" w:bidi="en_US"/>
+        </w:rPr>
+        <w:t>Israelites</w:t>
+      </w:r>
+      <w:r>
+        <w:rPr>
+          <w:lang w:val="en_US" w:bidi="en_US"/>
+        </w:rPr>
+        <w:t xml:space="preserve"> leave. From the New Testament we know that God will use angels for his final judgment.</w:t>
       </w:r>
     </w:p>
     <w:p>
@@ -1402,7 +2039,31 @@
         <w:rPr>
           <w:lang w:val="en_US" w:bidi="en_US"/>
         </w:rPr>
-        <w:t>An important type of angel is an archangel. This is an angel with special authority. The Bible mentions two archangels by name: Gabriel and Michael.</w:t>
+        <w:t xml:space="preserve">An important type of angel is an archangel. This is an angel with special </w:t>
+      </w:r>
+      <w:r>
+        <w:rPr>
+          <w:lang w:val="en_US" w:bidi="en_US"/>
+        </w:rPr>
+        <w:t>authority</w:t>
+      </w:r>
+      <w:r>
+        <w:rPr>
+          <w:lang w:val="en_US" w:bidi="en_US"/>
+        </w:rPr>
+        <w:t xml:space="preserve">. The Bible mentions two archangels by name: </w:t>
+      </w:r>
+      <w:r>
+        <w:rPr>
+          <w:lang w:val="en_US" w:bidi="en_US"/>
+        </w:rPr>
+        <w:t>Gabriel</w:t>
+      </w:r>
+      <w:r>
+        <w:rPr>
+          <w:lang w:val="en_US" w:bidi="en_US"/>
+        </w:rPr>
+        <w:t xml:space="preserve"> and Michael.</w:t>
       </w:r>
     </w:p>
     <w:p>
@@ -1545,6 +2206,68 @@
           <w:lang w:val="en_US" w:bidi="en_US"/>
         </w:rPr>
       </w:r>
+    </w:p>
+    <w:p>
+      <w:pPr/>
+      <w:r>
+        <w:rPr>
+          <w:lang w:val="en_US" w:bidi="en_US"/>
+        </w:rPr>
+      </w:r>
+      <w:hyperlink r:id="rId27">
+        <w:r>
+          <w:rPr>
+            <w:lang w:val="en_US" w:bidi="en_US"/>
+          </w:rPr>
+          <w:rPr>
+            <w:color w:val="0000EE"/>
+            <w:u w:val="single"/>
+          </w:rPr>
+          <w:t>webm file</w:t>
+        </w:r>
+      </w:hyperlink>
+      <w:r>
+        <w:rPr>
+          <w:lang w:val="en_US" w:bidi="en_US"/>
+        </w:rPr>
+        <w:t xml:space="preserve"> (1151938 KB)</w:t>
+      </w:r>
+      <w:r>
+        <w:rPr>
+          <w:lang w:val="en_US" w:bidi="en_US"/>
+        </w:rPr>
+      </w:r>
+    </w:p>
+    <w:p>
+      <w:pPr/>
+      <w:r>
+        <w:rPr>
+          <w:lang w:val="en_US" w:bidi="en_US"/>
+        </w:rPr>
+      </w:r>
+      <w:hyperlink r:id="rId28">
+        <w:r>
+          <w:rPr>
+            <w:lang w:val="en_US" w:bidi="en_US"/>
+          </w:rPr>
+          <w:rPr>
+            <w:color w:val="0000EE"/>
+            <w:u w:val="single"/>
+          </w:rPr>
+          <w:t>mp3 file</w:t>
+        </w:r>
+      </w:hyperlink>
+      <w:r>
+        <w:rPr>
+          <w:lang w:val="en_US" w:bidi="en_US"/>
+        </w:rPr>
+        <w:t xml:space="preserve"> (1482524 KB)</w:t>
+      </w:r>
+      <w:r>
+        <w:rPr>
+          <w:lang w:val="en_US" w:bidi="en_US"/>
+        </w:rPr>
+      </w:r>
       <w:r>
         <w:rPr>
           <w:lang w:val="en_US" w:bidi="en_US"/>
@@ -1650,6 +2373,68 @@
           <w:lang w:val="en_US" w:bidi="en_US"/>
         </w:rPr>
       </w:r>
+    </w:p>
+    <w:p>
+      <w:pPr/>
+      <w:r>
+        <w:rPr>
+          <w:lang w:val="en_US" w:bidi="en_US"/>
+        </w:rPr>
+      </w:r>
+      <w:hyperlink r:id="rId29">
+        <w:r>
+          <w:rPr>
+            <w:lang w:val="en_US" w:bidi="en_US"/>
+          </w:rPr>
+          <w:rPr>
+            <w:color w:val="0000EE"/>
+            <w:u w:val="single"/>
+          </w:rPr>
+          <w:t>webm file</w:t>
+        </w:r>
+      </w:hyperlink>
+      <w:r>
+        <w:rPr>
+          <w:lang w:val="en_US" w:bidi="en_US"/>
+        </w:rPr>
+        <w:t xml:space="preserve"> (478477 KB)</w:t>
+      </w:r>
+      <w:r>
+        <w:rPr>
+          <w:lang w:val="en_US" w:bidi="en_US"/>
+        </w:rPr>
+      </w:r>
+    </w:p>
+    <w:p>
+      <w:pPr/>
+      <w:r>
+        <w:rPr>
+          <w:lang w:val="en_US" w:bidi="en_US"/>
+        </w:rPr>
+      </w:r>
+      <w:hyperlink r:id="rId30">
+        <w:r>
+          <w:rPr>
+            <w:lang w:val="en_US" w:bidi="en_US"/>
+          </w:rPr>
+          <w:rPr>
+            <w:color w:val="0000EE"/>
+            <w:u w:val="single"/>
+          </w:rPr>
+          <w:t>mp3 file</w:t>
+        </w:r>
+      </w:hyperlink>
+      <w:r>
+        <w:rPr>
+          <w:lang w:val="en_US" w:bidi="en_US"/>
+        </w:rPr>
+        <w:t xml:space="preserve"> (643868 KB)</w:t>
+      </w:r>
+      <w:r>
+        <w:rPr>
+          <w:lang w:val="en_US" w:bidi="en_US"/>
+        </w:rPr>
+      </w:r>
       <w:r>
         <w:rPr>
           <w:lang w:val="en_US" w:bidi="en_US"/>
@@ -1691,6 +2476,258 @@
         <w:rPr>
           <w:lang w:val="en_US" w:bidi="en_US"/>
         </w:rPr>
+        <w:t xml:space="preserve">When people </w:t>
+      </w:r>
+      <w:r>
+        <w:rPr>
+          <w:b/>
+          <w:lang w:val="en_US" w:bidi="en_US"/>
+        </w:rPr>
+        <w:t>anoint</w:t>
+      </w:r>
+      <w:r>
+        <w:rPr>
+          <w:lang w:val="en_US" w:bidi="en_US"/>
+        </w:rPr>
+        <w:t xml:space="preserve"> an object or a place, they are pouring oil or </w:t>
+      </w:r>
+      <w:r>
+        <w:rPr>
+          <w:lang w:val="en_US" w:bidi="en_US"/>
+        </w:rPr>
+        <w:t>wine</w:t>
+      </w:r>
+      <w:r>
+        <w:rPr>
+          <w:lang w:val="en_US" w:bidi="en_US"/>
+        </w:rPr>
+        <w:t xml:space="preserve"> over the object or place. They do this to dedicate the object or place to God. In the Old Testament, Jacob had a </w:t>
+      </w:r>
+      <w:r>
+        <w:rPr>
+          <w:lang w:val="en_US" w:bidi="en_US"/>
+        </w:rPr>
+        <w:t>vision</w:t>
+      </w:r>
+      <w:r>
+        <w:rPr>
+          <w:lang w:val="en_US" w:bidi="en_US"/>
+        </w:rPr>
+        <w:t xml:space="preserve"> of God while he was sleeping with his head on a stone. When he woke up, he anointed this stone with oil to mark this place as </w:t>
+      </w:r>
+      <w:r>
+        <w:rPr>
+          <w:lang w:val="en_US" w:bidi="en_US"/>
+        </w:rPr>
+        <w:t>holy</w:t>
+      </w:r>
+      <w:r>
+        <w:rPr>
+          <w:lang w:val="en_US" w:bidi="en_US"/>
+        </w:rPr>
+        <w:t xml:space="preserve">, because God had spoken to him there. When the people of </w:t>
+      </w:r>
+      <w:r>
+        <w:rPr>
+          <w:lang w:val="en_US" w:bidi="en_US"/>
+        </w:rPr>
+        <w:t>Israel</w:t>
+      </w:r>
+      <w:r>
+        <w:rPr>
+          <w:lang w:val="en_US" w:bidi="en_US"/>
+        </w:rPr>
+        <w:t xml:space="preserve"> had made the </w:t>
+      </w:r>
+      <w:r>
+        <w:rPr>
+          <w:lang w:val="en_US" w:bidi="en_US"/>
+        </w:rPr>
+        <w:t>tabernacle</w:t>
+      </w:r>
+      <w:r>
+        <w:rPr>
+          <w:lang w:val="en_US" w:bidi="en_US"/>
+        </w:rPr>
+        <w:t xml:space="preserve">, the </w:t>
+      </w:r>
+      <w:r>
+        <w:rPr>
+          <w:lang w:val="en_US" w:bidi="en_US"/>
+        </w:rPr>
+        <w:t>priests</w:t>
+      </w:r>
+      <w:r>
+        <w:rPr>
+          <w:lang w:val="en_US" w:bidi="en_US"/>
+        </w:rPr>
+        <w:t xml:space="preserve"> anointed the objects in the tabernacle to dedicate them to God. These objects were now sacred, or holy, and would be used only for special service of </w:t>
+      </w:r>
+      <w:r>
+        <w:rPr>
+          <w:lang w:val="en_US" w:bidi="en_US"/>
+        </w:rPr>
+        <w:t>worship</w:t>
+      </w:r>
+      <w:r>
+        <w:rPr>
+          <w:lang w:val="en_US" w:bidi="en_US"/>
+        </w:rPr>
+        <w:t xml:space="preserve"> to God.</w:t>
+      </w:r>
+      <w:r>
+        <w:rPr>
+          <w:lang w:val="en_US" w:bidi="en_US"/>
+        </w:rPr>
+      </w:r>
+      <w:r>
+        <w:rPr>
+          <w:lang w:val="en_US" w:bidi="en_US"/>
+        </w:rPr>
+      </w:r>
+    </w:p>
+    <w:p>
+      <w:pPr/>
+      <w:r>
+        <w:rPr>
+          <w:lang w:val="en_US" w:bidi="en_US"/>
+        </w:rPr>
+      </w:r>
+    </w:p>
+    <w:p>
+      <w:pPr>
+        <w:pStyle w:val="Heading2"/>
+      </w:pPr>
+      <w:r>
+        <w:rPr>
+          <w:lang w:val="en_US" w:bidi="en_US"/>
+        </w:rPr>
+        <w:t>anoint</w:t>
+      </w:r>
+      <w:r>
+        <w:rPr>
+          <w:lang w:val="en_US" w:bidi="en_US"/>
+        </w:rPr>
+      </w:r>
+    </w:p>
+    <w:p>
+      <w:pPr>
+        <w:pStyle w:val="Heading4"/>
+      </w:pPr>
+      <w:r>
+        <w:rPr>
+          <w:lang w:val="en_US" w:bidi="en_US"/>
+        </w:rPr>
+        <w:t>Audio Content</w:t>
+      </w:r>
+      <w:r>
+        <w:rPr>
+          <w:lang w:val="en_US" w:bidi="en_US"/>
+        </w:rPr>
+      </w:r>
+    </w:p>
+    <w:p>
+      <w:pPr/>
+      <w:r>
+        <w:rPr>
+          <w:lang w:val="en_US" w:bidi="en_US"/>
+        </w:rPr>
+      </w:r>
+      <w:hyperlink r:id="rId31">
+        <w:r>
+          <w:rPr>
+            <w:lang w:val="en_US" w:bidi="en_US"/>
+          </w:rPr>
+          <w:rPr>
+            <w:color w:val="0000EE"/>
+            <w:u w:val="single"/>
+          </w:rPr>
+          <w:t>webm file</w:t>
+        </w:r>
+      </w:hyperlink>
+      <w:r>
+        <w:rPr>
+          <w:lang w:val="en_US" w:bidi="en_US"/>
+        </w:rPr>
+        <w:t xml:space="preserve"> (375110 KB)</w:t>
+      </w:r>
+      <w:r>
+        <w:rPr>
+          <w:lang w:val="en_US" w:bidi="en_US"/>
+        </w:rPr>
+      </w:r>
+    </w:p>
+    <w:p>
+      <w:pPr/>
+      <w:r>
+        <w:rPr>
+          <w:lang w:val="en_US" w:bidi="en_US"/>
+        </w:rPr>
+      </w:r>
+      <w:hyperlink r:id="rId32">
+        <w:r>
+          <w:rPr>
+            <w:lang w:val="en_US" w:bidi="en_US"/>
+          </w:rPr>
+          <w:rPr>
+            <w:color w:val="0000EE"/>
+            <w:u w:val="single"/>
+          </w:rPr>
+          <w:t>mp3 file</w:t>
+        </w:r>
+      </w:hyperlink>
+      <w:r>
+        <w:rPr>
+          <w:lang w:val="en_US" w:bidi="en_US"/>
+        </w:rPr>
+        <w:t xml:space="preserve"> (494780 KB)</w:t>
+      </w:r>
+      <w:r>
+        <w:rPr>
+          <w:lang w:val="en_US" w:bidi="en_US"/>
+        </w:rPr>
+      </w:r>
+      <w:r>
+        <w:rPr>
+          <w:lang w:val="en_US" w:bidi="en_US"/>
+        </w:rPr>
+      </w:r>
+    </w:p>
+    <w:p>
+      <w:pPr/>
+      <w:r>
+        <w:rPr>
+          <w:lang w:val="en_US" w:bidi="en_US"/>
+        </w:rPr>
+      </w:r>
+    </w:p>
+    <w:p>
+      <w:pPr>
+        <w:pStyle w:val="Heading2"/>
+      </w:pPr>
+      <w:r>
+        <w:rPr>
+          <w:lang w:val="en_US" w:bidi="en_US"/>
+        </w:rPr>
+        <w:t>anoint</w:t>
+      </w:r>
+      <w:r>
+        <w:rPr>
+          <w:lang w:val="en_US" w:bidi="en_US"/>
+        </w:rPr>
+      </w:r>
+    </w:p>
+    <w:p>
+      <w:pPr/>
+      <w:r>
+        <w:rPr>
+          <w:lang w:val="en_US" w:bidi="en_US"/>
+        </w:rPr>
+      </w:r>
+      <w:r>
+        <w:rPr>
+          <w:lang w:val="en_US" w:bidi="en_US"/>
+        </w:rPr>
         <w:t xml:space="preserve">To </w:t>
       </w:r>
       <w:r>
@@ -2076,6 +3113,68 @@
           <w:lang w:val="en_US" w:bidi="en_US"/>
         </w:rPr>
       </w:r>
+    </w:p>
+    <w:p>
+      <w:pPr/>
+      <w:r>
+        <w:rPr>
+          <w:lang w:val="en_US" w:bidi="en_US"/>
+        </w:rPr>
+      </w:r>
+      <w:hyperlink r:id="rId33">
+        <w:r>
+          <w:rPr>
+            <w:lang w:val="en_US" w:bidi="en_US"/>
+          </w:rPr>
+          <w:rPr>
+            <w:color w:val="0000EE"/>
+            <w:u w:val="single"/>
+          </w:rPr>
+          <w:t>webm file</w:t>
+        </w:r>
+      </w:hyperlink>
+      <w:r>
+        <w:rPr>
+          <w:lang w:val="en_US" w:bidi="en_US"/>
+        </w:rPr>
+        <w:t xml:space="preserve"> (1370625 KB)</w:t>
+      </w:r>
+      <w:r>
+        <w:rPr>
+          <w:lang w:val="en_US" w:bidi="en_US"/>
+        </w:rPr>
+      </w:r>
+    </w:p>
+    <w:p>
+      <w:pPr/>
+      <w:r>
+        <w:rPr>
+          <w:lang w:val="en_US" w:bidi="en_US"/>
+        </w:rPr>
+      </w:r>
+      <w:hyperlink r:id="rId34">
+        <w:r>
+          <w:rPr>
+            <w:lang w:val="en_US" w:bidi="en_US"/>
+          </w:rPr>
+          <w:rPr>
+            <w:color w:val="0000EE"/>
+            <w:u w:val="single"/>
+          </w:rPr>
+          <w:t>mp3 file</w:t>
+        </w:r>
+      </w:hyperlink>
+      <w:r>
+        <w:rPr>
+          <w:lang w:val="en_US" w:bidi="en_US"/>
+        </w:rPr>
+        <w:t xml:space="preserve"> (1763060 KB)</w:t>
+      </w:r>
+      <w:r>
+        <w:rPr>
+          <w:lang w:val="en_US" w:bidi="en_US"/>
+        </w:rPr>
+      </w:r>
       <w:r>
         <w:rPr>
           <w:lang w:val="en_US" w:bidi="en_US"/>
@@ -2098,6 +3197,174 @@
         <w:rPr>
           <w:lang w:val="en_US" w:bidi="en_US"/>
         </w:rPr>
+        <w:t>anoint</w:t>
+      </w:r>
+      <w:r>
+        <w:rPr>
+          <w:lang w:val="en_US" w:bidi="en_US"/>
+        </w:rPr>
+      </w:r>
+    </w:p>
+    <w:p>
+      <w:pPr/>
+      <w:r>
+        <w:rPr>
+          <w:lang w:val="en_US" w:bidi="en_US"/>
+        </w:rPr>
+      </w:r>
+      <w:r>
+        <w:rPr>
+          <w:lang w:val="en_US" w:bidi="en_US"/>
+        </w:rPr>
+        <w:t xml:space="preserve">People </w:t>
+      </w:r>
+      <w:r>
+        <w:rPr>
+          <w:b/>
+          <w:lang w:val="en_US" w:bidi="en_US"/>
+        </w:rPr>
+        <w:t>anointed</w:t>
+      </w:r>
+      <w:r>
+        <w:rPr>
+          <w:lang w:val="en_US" w:bidi="en_US"/>
+        </w:rPr>
+        <w:t xml:space="preserve"> dead bodies to show people honor and to help the decomposing bodies smell better. Women would mix sweet-smelling spices with oil and rub that into the cloth or body of the dead person.</w:t>
+      </w:r>
+      <w:r>
+        <w:rPr>
+          <w:lang w:val="en_US" w:bidi="en_US"/>
+        </w:rPr>
+      </w:r>
+      <w:r>
+        <w:rPr>
+          <w:lang w:val="en_US" w:bidi="en_US"/>
+        </w:rPr>
+      </w:r>
+    </w:p>
+    <w:p>
+      <w:pPr/>
+      <w:r>
+        <w:rPr>
+          <w:lang w:val="en_US" w:bidi="en_US"/>
+        </w:rPr>
+      </w:r>
+    </w:p>
+    <w:p>
+      <w:pPr>
+        <w:pStyle w:val="Heading2"/>
+      </w:pPr>
+      <w:r>
+        <w:rPr>
+          <w:lang w:val="en_US" w:bidi="en_US"/>
+        </w:rPr>
+        <w:t>anoint</w:t>
+      </w:r>
+      <w:r>
+        <w:rPr>
+          <w:lang w:val="en_US" w:bidi="en_US"/>
+        </w:rPr>
+      </w:r>
+    </w:p>
+    <w:p>
+      <w:pPr>
+        <w:pStyle w:val="Heading4"/>
+      </w:pPr>
+      <w:r>
+        <w:rPr>
+          <w:lang w:val="en_US" w:bidi="en_US"/>
+        </w:rPr>
+        <w:t>Audio Content</w:t>
+      </w:r>
+      <w:r>
+        <w:rPr>
+          <w:lang w:val="en_US" w:bidi="en_US"/>
+        </w:rPr>
+      </w:r>
+    </w:p>
+    <w:p>
+      <w:pPr/>
+      <w:r>
+        <w:rPr>
+          <w:lang w:val="en_US" w:bidi="en_US"/>
+        </w:rPr>
+      </w:r>
+      <w:hyperlink r:id="rId35">
+        <w:r>
+          <w:rPr>
+            <w:lang w:val="en_US" w:bidi="en_US"/>
+          </w:rPr>
+          <w:rPr>
+            <w:color w:val="0000EE"/>
+            <w:u w:val="single"/>
+          </w:rPr>
+          <w:t>webm file</w:t>
+        </w:r>
+      </w:hyperlink>
+      <w:r>
+        <w:rPr>
+          <w:lang w:val="en_US" w:bidi="en_US"/>
+        </w:rPr>
+        <w:t xml:space="preserve"> (158157 KB)</w:t>
+      </w:r>
+      <w:r>
+        <w:rPr>
+          <w:lang w:val="en_US" w:bidi="en_US"/>
+        </w:rPr>
+      </w:r>
+    </w:p>
+    <w:p>
+      <w:pPr/>
+      <w:r>
+        <w:rPr>
+          <w:lang w:val="en_US" w:bidi="en_US"/>
+        </w:rPr>
+      </w:r>
+      <w:hyperlink r:id="rId36">
+        <w:r>
+          <w:rPr>
+            <w:lang w:val="en_US" w:bidi="en_US"/>
+          </w:rPr>
+          <w:rPr>
+            <w:color w:val="0000EE"/>
+            <w:u w:val="single"/>
+          </w:rPr>
+          <w:t>mp3 file</w:t>
+        </w:r>
+      </w:hyperlink>
+      <w:r>
+        <w:rPr>
+          <w:lang w:val="en_US" w:bidi="en_US"/>
+        </w:rPr>
+        <w:t xml:space="preserve"> (209564 KB)</w:t>
+      </w:r>
+      <w:r>
+        <w:rPr>
+          <w:lang w:val="en_US" w:bidi="en_US"/>
+        </w:rPr>
+      </w:r>
+      <w:r>
+        <w:rPr>
+          <w:lang w:val="en_US" w:bidi="en_US"/>
+        </w:rPr>
+      </w:r>
+    </w:p>
+    <w:p>
+      <w:pPr/>
+      <w:r>
+        <w:rPr>
+          <w:lang w:val="en_US" w:bidi="en_US"/>
+        </w:rPr>
+      </w:r>
+    </w:p>
+    <w:p>
+      <w:pPr>
+        <w:pStyle w:val="Heading2"/>
+      </w:pPr>
+      <w:r>
+        <w:rPr>
+          <w:lang w:val="en_US" w:bidi="en_US"/>
+        </w:rPr>
         <w:t>apostle</w:t>
       </w:r>
       <w:r>
@@ -2208,7 +3475,19 @@
         <w:rPr>
           <w:lang w:val="en_US" w:bidi="en_US"/>
         </w:rPr>
-        <w:t xml:space="preserve"> is someone who has received a special authority from Jesus. An apostle is appointed. An apostle is speaking on behalf of Jesus.</w:t>
+        <w:t xml:space="preserve"> is someone who has received a special </w:t>
+      </w:r>
+      <w:r>
+        <w:rPr>
+          <w:lang w:val="en_US" w:bidi="en_US"/>
+        </w:rPr>
+        <w:t>authority</w:t>
+      </w:r>
+      <w:r>
+        <w:rPr>
+          <w:lang w:val="en_US" w:bidi="en_US"/>
+        </w:rPr>
+        <w:t xml:space="preserve"> from Jesus. An apostle is appointed. An apostle is speaking on behalf of Jesus.</w:t>
       </w:r>
     </w:p>
     <w:p>
@@ -2370,6 +3649,68 @@
           <w:lang w:val="en_US" w:bidi="en_US"/>
         </w:rPr>
       </w:r>
+    </w:p>
+    <w:p>
+      <w:pPr/>
+      <w:r>
+        <w:rPr>
+          <w:lang w:val="en_US" w:bidi="en_US"/>
+        </w:rPr>
+      </w:r>
+      <w:hyperlink r:id="rId37">
+        <w:r>
+          <w:rPr>
+            <w:lang w:val="en_US" w:bidi="en_US"/>
+          </w:rPr>
+          <w:rPr>
+            <w:color w:val="0000EE"/>
+            <w:u w:val="single"/>
+          </w:rPr>
+          <w:t>webm file</w:t>
+        </w:r>
+      </w:hyperlink>
+      <w:r>
+        <w:rPr>
+          <w:lang w:val="en_US" w:bidi="en_US"/>
+        </w:rPr>
+        <w:t xml:space="preserve"> (1080855 KB)</w:t>
+      </w:r>
+      <w:r>
+        <w:rPr>
+          <w:lang w:val="en_US" w:bidi="en_US"/>
+        </w:rPr>
+      </w:r>
+    </w:p>
+    <w:p>
+      <w:pPr/>
+      <w:r>
+        <w:rPr>
+          <w:lang w:val="en_US" w:bidi="en_US"/>
+        </w:rPr>
+      </w:r>
+      <w:hyperlink r:id="rId38">
+        <w:r>
+          <w:rPr>
+            <w:lang w:val="en_US" w:bidi="en_US"/>
+          </w:rPr>
+          <w:rPr>
+            <w:color w:val="0000EE"/>
+            <w:u w:val="single"/>
+          </w:rPr>
+          <w:t>mp3 file</w:t>
+        </w:r>
+      </w:hyperlink>
+      <w:r>
+        <w:rPr>
+          <w:lang w:val="en_US" w:bidi="en_US"/>
+        </w:rPr>
+        <w:t xml:space="preserve"> (1407164 KB)</w:t>
+      </w:r>
+      <w:r>
+        <w:rPr>
+          <w:lang w:val="en_US" w:bidi="en_US"/>
+        </w:rPr>
+      </w:r>
       <w:r>
         <w:rPr>
           <w:lang w:val="en_US" w:bidi="en_US"/>
@@ -2560,6 +3901,68 @@
           <w:lang w:val="en_US" w:bidi="en_US"/>
         </w:rPr>
         <w:t>Audio Content</w:t>
+      </w:r>
+      <w:r>
+        <w:rPr>
+          <w:lang w:val="en_US" w:bidi="en_US"/>
+        </w:rPr>
+      </w:r>
+    </w:p>
+    <w:p>
+      <w:pPr/>
+      <w:r>
+        <w:rPr>
+          <w:lang w:val="en_US" w:bidi="en_US"/>
+        </w:rPr>
+      </w:r>
+      <w:hyperlink r:id="rId39">
+        <w:r>
+          <w:rPr>
+            <w:lang w:val="en_US" w:bidi="en_US"/>
+          </w:rPr>
+          <w:rPr>
+            <w:color w:val="0000EE"/>
+            <w:u w:val="single"/>
+          </w:rPr>
+          <w:t>webm file</w:t>
+        </w:r>
+      </w:hyperlink>
+      <w:r>
+        <w:rPr>
+          <w:lang w:val="en_US" w:bidi="en_US"/>
+        </w:rPr>
+        <w:t xml:space="preserve"> (442777 KB)</w:t>
+      </w:r>
+      <w:r>
+        <w:rPr>
+          <w:lang w:val="en_US" w:bidi="en_US"/>
+        </w:rPr>
+      </w:r>
+    </w:p>
+    <w:p>
+      <w:pPr/>
+      <w:r>
+        <w:rPr>
+          <w:lang w:val="en_US" w:bidi="en_US"/>
+        </w:rPr>
+      </w:r>
+      <w:hyperlink r:id="rId40">
+        <w:r>
+          <w:rPr>
+            <w:lang w:val="en_US" w:bidi="en_US"/>
+          </w:rPr>
+          <w:rPr>
+            <w:color w:val="0000EE"/>
+            <w:u w:val="single"/>
+          </w:rPr>
+          <w:t>mp3 file</w:t>
+        </w:r>
+      </w:hyperlink>
+      <w:r>
+        <w:rPr>
+          <w:lang w:val="en_US" w:bidi="en_US"/>
+        </w:rPr>
+        <w:t xml:space="preserve"> (561260 KB)</w:t>
       </w:r>
       <w:r>
         <w:rPr>

</xml_diff>

<commit_message>
Update Bible resource files and metadata for 2026-05-07 release
</commit_message>
<xml_diff>
--- a/eng/docx/001.content.docx
+++ b/eng/docx/001.content.docx
@@ -39,80 +39,37 @@
           <w:b/>
           <w:lang w:val="en_US" w:bidi="en_US"/>
         </w:rPr>
-        <w:t>Familiarization, Internalization, Articulation (Fia) Terms</w:t>
-      </w:r>
-      <w:r>
-        <w:rPr>
-          <w:lang w:val="en_US" w:bidi="en_US"/>
-        </w:rPr>
-        <w:t xml:space="preserve"> is based on: </w:t>
-      </w:r>
-      <w:r>
-        <w:rPr>
-          <w:lang w:val="en_US" w:bidi="en_US"/>
-        </w:rPr>
-        <w:t>Familiarization, Internalization, Articulation (Fia) Terms</w:t>
-      </w:r>
-      <w:r>
-        <w:rPr>
-          <w:lang w:val="en_US" w:bidi="en_US"/>
-        </w:rPr>
-        <w:t xml:space="preserve">, </w:t>
-      </w:r>
-      <w:hyperlink r:id="rId13">
-        <w:r>
-          <w:rPr>
-            <w:lang w:val="en_US" w:bidi="en_US"/>
-          </w:rPr>
-          <w:rPr>
-            <w:color w:val="0000EE"/>
-            <w:u w:val="single"/>
-          </w:rPr>
-          <w:t>SRV Partners</w:t>
-        </w:r>
-      </w:hyperlink>
-      <w:r>
-        <w:rPr>
-          <w:lang w:val="en_US" w:bidi="en_US"/>
-        </w:rPr>
-        <w:t xml:space="preserve">, 2023, which is licensed under a </w:t>
-      </w:r>
-      <w:hyperlink r:id="rId14">
-        <w:r>
-          <w:rPr>
-            <w:lang w:val="en_US" w:bidi="en_US"/>
-          </w:rPr>
-          <w:rPr>
-            <w:color w:val="0000EE"/>
-            <w:u w:val="single"/>
-          </w:rPr>
-          <w:t>CC BY-SA 4.0 license</w:t>
-        </w:r>
-      </w:hyperlink>
-      <w:r>
-        <w:rPr>
-          <w:lang w:val="en_US" w:bidi="en_US"/>
-        </w:rPr>
-        <w:t>.</w:t>
-      </w:r>
-      <w:r>
-        <w:rPr>
-          <w:lang w:val="en_US" w:bidi="en_US"/>
-        </w:rPr>
-      </w:r>
-    </w:p>
-    <w:p>
-      <w:pPr/>
-      <w:r>
-        <w:rPr>
-          <w:lang w:val="en_US" w:bidi="en_US"/>
-        </w:rPr>
-      </w:r>
-      <w:r>
-        <w:rPr>
-          <w:lang w:val="en_US" w:bidi="en_US"/>
-        </w:rPr>
-        <w:t>This PDF version is provided under the same license.</w:t>
+        <w:t>Familiarization, Internalization, Articulation (FIA) Key Terms</w:t>
+      </w:r>
+      <w:r>
+        <w:rPr>
+          <w:lang w:val="en_US" w:bidi="en_US"/>
+        </w:rPr>
+        <w:t xml:space="preserve"> © 2023 SRV Partners Released under CC BY-SA 4.0 license. </w:t>
+      </w:r>
+      <w:r>
+        <w:rPr>
+          <w:lang w:val="en_US" w:bidi="en_US"/>
+        </w:rPr>
+        <w:t>Familiarization, Internalization, Articulation (FIA) Key Terms</w:t>
+      </w:r>
+      <w:r>
+        <w:rPr>
+          <w:lang w:val="en_US" w:bidi="en_US"/>
+        </w:rPr>
+        <w:t xml:space="preserve"> has been adapted in the following languages Tok Pisin, عربي, Français, हिंदी, Bahasa Indonesia, Português, Русский, Español, Kiswahili, 简体中文 from </w:t>
+      </w:r>
+      <w:r>
+        <w:rPr>
+          <w:lang w:val="en_US" w:bidi="en_US"/>
+        </w:rPr>
+        <w:t>Familiarization, Internalization, Articulation (FIA)</w:t>
+      </w:r>
+      <w:r>
+        <w:rPr>
+          <w:lang w:val="en_US" w:bidi="en_US"/>
+        </w:rPr>
+        <w:t xml:space="preserve"> © 2023 SRV Partners. Released under CC BY-SA 4.0 license by Mission Mutual</w:t>
       </w:r>
       <w:r>
         <w:rPr>
@@ -261,7 +218,7 @@
         </w:rPr>
         <w:t xml:space="preserve"> is the Aramaic word for "father." Aramaic was the language that the people in </w:t>
       </w:r>
-      <w:hyperlink r:id="rId15">
+      <w:hyperlink r:id="rId13">
         <w:r>
           <w:rPr>
             <w:lang w:val="en_US" w:bidi="en_US"/>
@@ -279,7 +236,7 @@
         </w:rPr>
         <w:t xml:space="preserve"> spoke in Jesus's time. Jesus calls God "abba" when he </w:t>
       </w:r>
-      <w:hyperlink r:id="rId16">
+      <w:hyperlink r:id="rId14">
         <w:r>
           <w:rPr>
             <w:lang w:val="en_US" w:bidi="en_US"/>
@@ -297,7 +254,7 @@
         </w:rPr>
         <w:t xml:space="preserve"> to God just before he was arrested and then </w:t>
       </w:r>
-      <w:hyperlink r:id="rId17">
+      <w:hyperlink r:id="rId15">
         <w:r>
           <w:rPr>
             <w:lang w:val="en_US" w:bidi="en_US"/>
@@ -315,7 +272,7 @@
         </w:rPr>
         <w:t xml:space="preserve">. Paul later wrote in his letters that the </w:t>
       </w:r>
-      <w:hyperlink r:id="rId18">
+      <w:hyperlink r:id="rId16">
         <w:r>
           <w:rPr>
             <w:lang w:val="en_US" w:bidi="en_US"/>
@@ -391,7 +348,7 @@
           <w:lang w:val="en_US" w:bidi="en_US"/>
         </w:rPr>
       </w:r>
-      <w:hyperlink r:id="rId19">
+      <w:hyperlink r:id="rId17">
         <w:r>
           <w:rPr>
             <w:lang w:val="en_US" w:bidi="en_US"/>
@@ -464,7 +421,7 @@
         </w:rPr>
         <w:t xml:space="preserve"> was the first ancestor of the </w:t>
       </w:r>
-      <w:hyperlink r:id="rId20">
+      <w:hyperlink r:id="rId18">
         <w:r>
           <w:rPr>
             <w:lang w:val="en_US" w:bidi="en_US"/>
@@ -482,7 +439,7 @@
         </w:rPr>
         <w:t xml:space="preserve">, the </w:t>
       </w:r>
-      <w:hyperlink r:id="rId21">
+      <w:hyperlink r:id="rId19">
         <w:r>
           <w:rPr>
             <w:lang w:val="en_US" w:bidi="en_US"/>
@@ -514,7 +471,7 @@
         </w:rPr>
         <w:t xml:space="preserve">Abraham lived about two thousand years before the birth of Jesus. He first lived in a region named Ur, which was somewhere east of </w:t>
       </w:r>
-      <w:hyperlink r:id="rId15">
+      <w:hyperlink r:id="rId13">
         <w:r>
           <w:rPr>
             <w:lang w:val="en_US" w:bidi="en_US"/>
@@ -532,7 +489,7 @@
         </w:rPr>
         <w:t xml:space="preserve">. Abraham's father Terah took his sons and their wives with him and left Ur, because he wanted to go to the country named </w:t>
       </w:r>
-      <w:hyperlink r:id="rId22">
+      <w:hyperlink r:id="rId20">
         <w:r>
           <w:rPr>
             <w:lang w:val="en_US" w:bidi="en_US"/>
@@ -550,7 +507,7 @@
         </w:rPr>
         <w:t xml:space="preserve">, but he stopped in a place called Haran. This was still quite far away from Canaan. The family began to live there, and after some time Abraham's father died. Abraham and his family did not know God; they </w:t>
       </w:r>
-      <w:hyperlink r:id="rId23">
+      <w:hyperlink r:id="rId21">
         <w:r>
           <w:rPr>
             <w:lang w:val="en_US" w:bidi="en_US"/>
@@ -568,7 +525,7 @@
         </w:rPr>
         <w:t xml:space="preserve"> </w:t>
       </w:r>
-      <w:hyperlink r:id="rId24">
+      <w:hyperlink r:id="rId22">
         <w:r>
           <w:rPr>
             <w:lang w:val="en_US" w:bidi="en_US"/>
@@ -600,7 +557,7 @@
         </w:rPr>
         <w:t xml:space="preserve">When Abraham was 75 years old, God spoke to him. God told him to leave behind his homeland, and to go to a place that God would show him. God said that he would </w:t>
       </w:r>
-      <w:hyperlink r:id="rId25">
+      <w:hyperlink r:id="rId23">
         <w:r>
           <w:rPr>
             <w:lang w:val="en_US" w:bidi="en_US"/>
@@ -618,7 +575,7 @@
         </w:rPr>
         <w:t xml:space="preserve"> Abraham, that he would make a great </w:t>
       </w:r>
-      <w:hyperlink r:id="rId26">
+      <w:hyperlink r:id="rId24">
         <w:r>
           <w:rPr>
             <w:lang w:val="en_US" w:bidi="en_US"/>
@@ -636,7 +593,7 @@
         </w:rPr>
         <w:t xml:space="preserve"> out of him, and that God would bless all the nations of the world through Abraham. And Abraham obeyed God! Together with his wife Sarah and his nephew Lot he set out on a long journey. When he came to Canaan, God told him that this was the country that he would give to Abraham and to his </w:t>
       </w:r>
-      <w:hyperlink r:id="rId27">
+      <w:hyperlink r:id="rId25">
         <w:r>
           <w:rPr>
             <w:lang w:val="en_US" w:bidi="en_US"/>
@@ -668,7 +625,7 @@
         </w:rPr>
         <w:t xml:space="preserve">However, Abraham did not have any descendants yet. He had no children, and he was already an old man! But he </w:t>
       </w:r>
-      <w:hyperlink r:id="rId28">
+      <w:hyperlink r:id="rId26">
         <w:r>
           <w:rPr>
             <w:lang w:val="en_US" w:bidi="en_US"/>
@@ -786,7 +743,7 @@
           <w:lang w:val="en_US" w:bidi="en_US"/>
         </w:rPr>
       </w:r>
-      <w:hyperlink r:id="rId29">
+      <w:hyperlink r:id="rId27">
         <w:r>
           <w:rPr>
             <w:lang w:val="en_US" w:bidi="en_US"/>
@@ -865,7 +822,7 @@
         </w:rPr>
         <w:t xml:space="preserve"> is a word in the Hebrew language, which is the language of the Old Testament. Adonai means lord, or master. The </w:t>
       </w:r>
-      <w:hyperlink r:id="rId21">
+      <w:hyperlink r:id="rId19">
         <w:r>
           <w:rPr>
             <w:lang w:val="en_US" w:bidi="en_US"/>
@@ -941,7 +898,7 @@
           <w:lang w:val="en_US" w:bidi="en_US"/>
         </w:rPr>
       </w:r>
-      <w:hyperlink r:id="rId30">
+      <w:hyperlink r:id="rId28">
         <w:r>
           <w:rPr>
             <w:lang w:val="en_US" w:bidi="en_US"/>
@@ -1014,7 +971,7 @@
         </w:rPr>
         <w:t xml:space="preserve"> is a form of sexual </w:t>
       </w:r>
-      <w:hyperlink r:id="rId31">
+      <w:hyperlink r:id="rId29">
         <w:r>
           <w:rPr>
             <w:lang w:val="en_US" w:bidi="en_US"/>
@@ -1046,7 +1003,7 @@
         </w:rPr>
         <w:t xml:space="preserve">When a man had sexual relations with an unmarried woman or </w:t>
       </w:r>
-      <w:hyperlink r:id="rId32">
+      <w:hyperlink r:id="rId30">
         <w:r>
           <w:rPr>
             <w:lang w:val="en_US" w:bidi="en_US"/>
@@ -1078,7 +1035,7 @@
         </w:rPr>
         <w:t xml:space="preserve">God hates adultery and every form of sexual sin. God often compares the disobedience of people to himself with adultery: When people are unfaithful to God and begin to </w:t>
       </w:r>
-      <w:hyperlink r:id="rId23">
+      <w:hyperlink r:id="rId21">
         <w:r>
           <w:rPr>
             <w:lang w:val="en_US" w:bidi="en_US"/>
@@ -1096,7 +1053,7 @@
         </w:rPr>
         <w:t xml:space="preserve"> </w:t>
       </w:r>
-      <w:hyperlink r:id="rId24">
+      <w:hyperlink r:id="rId22">
         <w:r>
           <w:rPr>
             <w:lang w:val="en_US" w:bidi="en_US"/>
@@ -1199,7 +1156,7 @@
           <w:lang w:val="en_US" w:bidi="en_US"/>
         </w:rPr>
       </w:r>
-      <w:hyperlink r:id="rId33">
+      <w:hyperlink r:id="rId31">
         <w:r>
           <w:rPr>
             <w:lang w:val="en_US" w:bidi="en_US"/>
@@ -1350,7 +1307,7 @@
           <w:lang w:val="en_US" w:bidi="en_US"/>
         </w:rPr>
       </w:r>
-      <w:hyperlink r:id="rId34">
+      <w:hyperlink r:id="rId32">
         <w:r>
           <w:rPr>
             <w:lang w:val="en_US" w:bidi="en_US"/>
@@ -1429,7 +1386,7 @@
         </w:rPr>
         <w:t xml:space="preserve"> is a place where people make </w:t>
       </w:r>
-      <w:hyperlink r:id="rId35">
+      <w:hyperlink r:id="rId33">
         <w:r>
           <w:rPr>
             <w:lang w:val="en_US" w:bidi="en_US"/>
@@ -1447,7 +1404,7 @@
         </w:rPr>
         <w:t xml:space="preserve"> or </w:t>
       </w:r>
-      <w:hyperlink r:id="rId36">
+      <w:hyperlink r:id="rId34">
         <w:r>
           <w:rPr>
             <w:lang w:val="en_US" w:bidi="en_US"/>
@@ -1479,7 +1436,7 @@
         </w:rPr>
         <w:t xml:space="preserve">Before the </w:t>
       </w:r>
-      <w:hyperlink r:id="rId20">
+      <w:hyperlink r:id="rId18">
         <w:r>
           <w:rPr>
             <w:lang w:val="en_US" w:bidi="en_US"/>
@@ -1497,7 +1454,7 @@
         </w:rPr>
         <w:t xml:space="preserve"> built the </w:t>
       </w:r>
-      <w:hyperlink r:id="rId37">
+      <w:hyperlink r:id="rId35">
         <w:r>
           <w:rPr>
             <w:lang w:val="en_US" w:bidi="en_US"/>
@@ -1515,7 +1472,7 @@
         </w:rPr>
         <w:t xml:space="preserve"> and the </w:t>
       </w:r>
-      <w:hyperlink r:id="rId38">
+      <w:hyperlink r:id="rId36">
         <w:r>
           <w:rPr>
             <w:lang w:val="en_US" w:bidi="en_US"/>
@@ -1605,7 +1562,7 @@
           <w:lang w:val="en_US" w:bidi="en_US"/>
         </w:rPr>
       </w:r>
-      <w:hyperlink r:id="rId39">
+      <w:hyperlink r:id="rId37">
         <w:r>
           <w:rPr>
             <w:lang w:val="en_US" w:bidi="en_US"/>
@@ -1678,7 +1635,7 @@
         </w:rPr>
         <w:t xml:space="preserve"> is an </w:t>
       </w:r>
-      <w:hyperlink r:id="rId40">
+      <w:hyperlink r:id="rId38">
         <w:r>
           <w:rPr>
             <w:lang w:val="en_US" w:bidi="en_US"/>
@@ -1710,7 +1667,7 @@
         </w:rPr>
         <w:t xml:space="preserve">When someone tells you that something good is going to happen, you can respond by saying "Amen!" This means that you say that you hope and </w:t>
       </w:r>
-      <w:hyperlink r:id="rId28">
+      <w:hyperlink r:id="rId26">
         <w:r>
           <w:rPr>
             <w:lang w:val="en_US" w:bidi="en_US"/>
@@ -1742,7 +1699,7 @@
         </w:rPr>
         <w:t xml:space="preserve">When someone offers a </w:t>
       </w:r>
-      <w:hyperlink r:id="rId16">
+      <w:hyperlink r:id="rId14">
         <w:r>
           <w:rPr>
             <w:lang w:val="en_US" w:bidi="en_US"/>
@@ -1832,7 +1789,7 @@
           <w:lang w:val="en_US" w:bidi="en_US"/>
         </w:rPr>
       </w:r>
-      <w:hyperlink r:id="rId41">
+      <w:hyperlink r:id="rId39">
         <w:r>
           <w:rPr>
             <w:lang w:val="en_US" w:bidi="en_US"/>
@@ -1911,7 +1868,7 @@
         </w:rPr>
         <w:t xml:space="preserve"> is a supernatural, spiritual being created by God. Angels give messages from God to people; for instance, an angel told </w:t>
       </w:r>
-      <w:hyperlink r:id="rId42">
+      <w:hyperlink r:id="rId40">
         <w:r>
           <w:rPr>
             <w:lang w:val="en_US" w:bidi="en_US"/>
@@ -1957,7 +1914,7 @@
         </w:rPr>
         <w:t xml:space="preserve">An angel can also do a specific task for God. They can help people or protect them; for instance, a whole army of angels stood around the </w:t>
       </w:r>
-      <w:hyperlink r:id="rId43">
+      <w:hyperlink r:id="rId41">
         <w:r>
           <w:rPr>
             <w:lang w:val="en_US" w:bidi="en_US"/>
@@ -1989,7 +1946,7 @@
         </w:rPr>
         <w:t xml:space="preserve">God also uses angels to give punishments to people. For instance, an angel killed the firstborn sons in Egypt after the king refused to let the </w:t>
       </w:r>
-      <w:hyperlink r:id="rId20">
+      <w:hyperlink r:id="rId18">
         <w:r>
           <w:rPr>
             <w:lang w:val="en_US" w:bidi="en_US"/>
@@ -2021,7 +1978,7 @@
         </w:rPr>
         <w:t xml:space="preserve">Another very important task for angels is to </w:t>
       </w:r>
-      <w:hyperlink r:id="rId23">
+      <w:hyperlink r:id="rId21">
         <w:r>
           <w:rPr>
             <w:lang w:val="en_US" w:bidi="en_US"/>
@@ -2053,7 +2010,7 @@
         </w:rPr>
         <w:t xml:space="preserve">An important type of angel is an archangel. This is an angel with special </w:t>
       </w:r>
-      <w:hyperlink r:id="rId44">
+      <w:hyperlink r:id="rId42">
         <w:r>
           <w:rPr>
             <w:lang w:val="en_US" w:bidi="en_US"/>
@@ -2071,7 +2028,7 @@
         </w:rPr>
         <w:t xml:space="preserve">. The Bible mentions two archangels by name: </w:t>
       </w:r>
-      <w:hyperlink r:id="rId45">
+      <w:hyperlink r:id="rId43">
         <w:r>
           <w:rPr>
             <w:lang w:val="en_US" w:bidi="en_US"/>
@@ -2103,7 +2060,7 @@
         </w:rPr>
         <w:t xml:space="preserve">Not all angels stayed obedient to God. Some angels rebelled. They became </w:t>
       </w:r>
-      <w:hyperlink r:id="rId46">
+      <w:hyperlink r:id="rId44">
         <w:r>
           <w:rPr>
             <w:lang w:val="en_US" w:bidi="en_US"/>
@@ -2121,7 +2078,7 @@
         </w:rPr>
         <w:t xml:space="preserve">, and the name of their leader is </w:t>
       </w:r>
-      <w:hyperlink r:id="rId47">
+      <w:hyperlink r:id="rId45">
         <w:r>
           <w:rPr>
             <w:lang w:val="en_US" w:bidi="en_US"/>
@@ -2168,7 +2125,7 @@
         </w:rPr>
         <w:t>Make sure people will not get confused with the word you have chosen for "</w:t>
       </w:r>
-      <w:hyperlink r:id="rId43">
+      <w:hyperlink r:id="rId41">
         <w:r>
           <w:rPr>
             <w:lang w:val="en_US" w:bidi="en_US"/>
@@ -2186,7 +2143,7 @@
         </w:rPr>
         <w:t xml:space="preserve">." A prophet also gives messages from God to the people, but a prophet is a human person, belonging to earth, while an angel is a supernatural being, belonging to </w:t>
       </w:r>
-      <w:hyperlink r:id="rId48">
+      <w:hyperlink r:id="rId46">
         <w:r>
           <w:rPr>
             <w:lang w:val="en_US" w:bidi="en_US"/>
@@ -2262,7 +2219,7 @@
           <w:lang w:val="en_US" w:bidi="en_US"/>
         </w:rPr>
       </w:r>
-      <w:hyperlink r:id="rId49">
+      <w:hyperlink r:id="rId47">
         <w:r>
           <w:rPr>
             <w:lang w:val="en_US" w:bidi="en_US"/>
@@ -2328,7 +2285,7 @@
         </w:rPr>
         <w:t xml:space="preserve">An angel is a supernatural, spiritual being created by God. Angels give messages from God to people. The "angel of the Lord" or "angel of Yahweh" is a special angel who speaks with so much </w:t>
       </w:r>
-      <w:hyperlink r:id="rId44">
+      <w:hyperlink r:id="rId42">
         <w:r>
           <w:rPr>
             <w:lang w:val="en_US" w:bidi="en_US"/>
@@ -2404,7 +2361,7 @@
           <w:lang w:val="en_US" w:bidi="en_US"/>
         </w:rPr>
       </w:r>
-      <w:hyperlink r:id="rId50">
+      <w:hyperlink r:id="rId48">
         <w:r>
           <w:rPr>
             <w:lang w:val="en_US" w:bidi="en_US"/>
@@ -2497,7 +2454,7 @@
         </w:rPr>
         <w:t xml:space="preserve">In the Old Testament, before God gave someone a special task, he would instruct someone else to pour oil over that person's head. The oil was a symbol for the </w:t>
       </w:r>
-      <w:hyperlink r:id="rId18">
+      <w:hyperlink r:id="rId16">
         <w:r>
           <w:rPr>
             <w:lang w:val="en_US" w:bidi="en_US"/>
@@ -2515,7 +2472,7 @@
         </w:rPr>
         <w:t xml:space="preserve">. This ritual made clear that God had set this person apart for a special purpose. It also made clear that God was giving this person special </w:t>
       </w:r>
-      <w:hyperlink r:id="rId44">
+      <w:hyperlink r:id="rId42">
         <w:r>
           <w:rPr>
             <w:lang w:val="en_US" w:bidi="en_US"/>
@@ -2533,7 +2490,7 @@
         </w:rPr>
         <w:t xml:space="preserve">. The person was then called "anointed." For instance, God told Samuel to anoint </w:t>
       </w:r>
-      <w:hyperlink r:id="rId51">
+      <w:hyperlink r:id="rId49">
         <w:r>
           <w:rPr>
             <w:lang w:val="en_US" w:bidi="en_US"/>
@@ -2551,7 +2508,7 @@
         </w:rPr>
         <w:t xml:space="preserve"> as </w:t>
       </w:r>
-      <w:hyperlink r:id="rId52">
+      <w:hyperlink r:id="rId50">
         <w:r>
           <w:rPr>
             <w:lang w:val="en_US" w:bidi="en_US"/>
@@ -2569,7 +2526,7 @@
         </w:rPr>
         <w:t xml:space="preserve"> of </w:t>
       </w:r>
-      <w:hyperlink r:id="rId15">
+      <w:hyperlink r:id="rId13">
         <w:r>
           <w:rPr>
             <w:lang w:val="en_US" w:bidi="en_US"/>
@@ -2587,7 +2544,7 @@
         </w:rPr>
         <w:t xml:space="preserve">. God told Moses to anoint Aaron as </w:t>
       </w:r>
-      <w:hyperlink r:id="rId53">
+      <w:hyperlink r:id="rId51">
         <w:r>
           <w:rPr>
             <w:lang w:val="en_US" w:bidi="en_US"/>
@@ -2605,7 +2562,7 @@
         </w:rPr>
         <w:t xml:space="preserve">. And God told the prophet </w:t>
       </w:r>
-      <w:hyperlink r:id="rId54">
+      <w:hyperlink r:id="rId52">
         <w:r>
           <w:rPr>
             <w:lang w:val="en_US" w:bidi="en_US"/>
@@ -2623,7 +2580,7 @@
         </w:rPr>
         <w:t xml:space="preserve"> to anoint Elisha as a </w:t>
       </w:r>
-      <w:hyperlink r:id="rId43">
+      <w:hyperlink r:id="rId41">
         <w:r>
           <w:rPr>
             <w:lang w:val="en_US" w:bidi="en_US"/>
@@ -2669,7 +2626,7 @@
         </w:rPr>
         <w:t xml:space="preserve">People could also anoint objects. The </w:t>
       </w:r>
-      <w:hyperlink r:id="rId55">
+      <w:hyperlink r:id="rId53">
         <w:r>
           <w:rPr>
             <w:lang w:val="en_US" w:bidi="en_US"/>
@@ -2687,7 +2644,7 @@
         </w:rPr>
         <w:t xml:space="preserve"> anointed the objects that were used in the </w:t>
       </w:r>
-      <w:hyperlink r:id="rId38">
+      <w:hyperlink r:id="rId36">
         <w:r>
           <w:rPr>
             <w:lang w:val="en_US" w:bidi="en_US"/>
@@ -2713,7 +2670,7 @@
           <w:lang w:val="en_US" w:bidi="en_US"/>
         </w:rPr>
       </w:r>
-      <w:hyperlink r:id="rId21">
+      <w:hyperlink r:id="rId19">
         <w:r>
           <w:rPr>
             <w:lang w:val="en_US" w:bidi="en_US"/>
@@ -2731,7 +2688,7 @@
         </w:rPr>
         <w:t xml:space="preserve"> people also used anointing as a daily activity that had no special meaning. They used sweet smelling oil to take care of their skin and their hair. Jesus told the people that if they </w:t>
       </w:r>
-      <w:hyperlink r:id="rId56">
+      <w:hyperlink r:id="rId54">
         <w:r>
           <w:rPr>
             <w:lang w:val="en_US" w:bidi="en_US"/>
@@ -2763,7 +2720,7 @@
         </w:rPr>
         <w:t xml:space="preserve">People also put some oil on guests to show them they were welcome and honored. There are two stories in the </w:t>
       </w:r>
-      <w:hyperlink r:id="rId57">
+      <w:hyperlink r:id="rId55">
         <w:r>
           <w:rPr>
             <w:lang w:val="en_US" w:bidi="en_US"/>
@@ -2795,7 +2752,7 @@
         </w:rPr>
         <w:t xml:space="preserve">Jewish people also anointed a person's body after his death. After Jesus died, the women are bringing sweet smelling oil to the </w:t>
       </w:r>
-      <w:hyperlink r:id="rId58">
+      <w:hyperlink r:id="rId56">
         <w:r>
           <w:rPr>
             <w:lang w:val="en_US" w:bidi="en_US"/>
@@ -2827,7 +2784,7 @@
         </w:rPr>
         <w:t xml:space="preserve">In the New Testament, the early </w:t>
       </w:r>
-      <w:hyperlink r:id="rId59">
+      <w:hyperlink r:id="rId57">
         <w:r>
           <w:rPr>
             <w:lang w:val="en_US" w:bidi="en_US"/>
@@ -2845,7 +2802,7 @@
         </w:rPr>
         <w:t xml:space="preserve"> sometimes used oil together with </w:t>
       </w:r>
-      <w:hyperlink r:id="rId16">
+      <w:hyperlink r:id="rId14">
         <w:r>
           <w:rPr>
             <w:lang w:val="en_US" w:bidi="en_US"/>
@@ -2863,7 +2820,7 @@
         </w:rPr>
         <w:t xml:space="preserve"> if someone was sick. The </w:t>
       </w:r>
-      <w:hyperlink r:id="rId60">
+      <w:hyperlink r:id="rId58">
         <w:r>
           <w:rPr>
             <w:lang w:val="en_US" w:bidi="en_US"/>
@@ -2881,7 +2838,7 @@
         </w:rPr>
         <w:t xml:space="preserve"> </w:t>
       </w:r>
-      <w:hyperlink r:id="rId61">
+      <w:hyperlink r:id="rId59">
         <w:r>
           <w:rPr>
             <w:lang w:val="en_US" w:bidi="en_US"/>
@@ -2899,7 +2856,7 @@
         </w:rPr>
         <w:t xml:space="preserve">, in his letter, says that if someone is sick, the other </w:t>
       </w:r>
-      <w:hyperlink r:id="rId62">
+      <w:hyperlink r:id="rId60">
         <w:r>
           <w:rPr>
             <w:lang w:val="en_US" w:bidi="en_US"/>
@@ -2975,7 +2932,7 @@
           <w:lang w:val="en_US" w:bidi="en_US"/>
         </w:rPr>
       </w:r>
-      <w:hyperlink r:id="rId63">
+      <w:hyperlink r:id="rId61">
         <w:r>
           <w:rPr>
             <w:lang w:val="en_US" w:bidi="en_US"/>
@@ -3112,7 +3069,7 @@
           <w:lang w:val="en_US" w:bidi="en_US"/>
         </w:rPr>
       </w:r>
-      <w:hyperlink r:id="rId64">
+      <w:hyperlink r:id="rId62">
         <w:r>
           <w:rPr>
             <w:lang w:val="en_US" w:bidi="en_US"/>
@@ -3191,7 +3148,7 @@
         </w:rPr>
         <w:t xml:space="preserve"> an object or a place, they are pouring oil or </w:t>
       </w:r>
-      <w:hyperlink r:id="rId65">
+      <w:hyperlink r:id="rId63">
         <w:r>
           <w:rPr>
             <w:lang w:val="en_US" w:bidi="en_US"/>
@@ -3209,7 +3166,7 @@
         </w:rPr>
         <w:t xml:space="preserve"> over the object or place. They do this to dedicate the object or place to God. In the Old Testament, Jacob had a </w:t>
       </w:r>
-      <w:hyperlink r:id="rId66">
+      <w:hyperlink r:id="rId64">
         <w:r>
           <w:rPr>
             <w:lang w:val="en_US" w:bidi="en_US"/>
@@ -3227,7 +3184,7 @@
         </w:rPr>
         <w:t xml:space="preserve"> of God while he was sleeping with his head on a stone. When he woke up, he anointed this stone with oil to mark this place as </w:t>
       </w:r>
-      <w:hyperlink r:id="rId67">
+      <w:hyperlink r:id="rId65">
         <w:r>
           <w:rPr>
             <w:lang w:val="en_US" w:bidi="en_US"/>
@@ -3245,7 +3202,7 @@
         </w:rPr>
         <w:t xml:space="preserve">, because God had spoken to him there. When the people of </w:t>
       </w:r>
-      <w:hyperlink r:id="rId15">
+      <w:hyperlink r:id="rId13">
         <w:r>
           <w:rPr>
             <w:lang w:val="en_US" w:bidi="en_US"/>
@@ -3263,7 +3220,7 @@
         </w:rPr>
         <w:t xml:space="preserve"> had made the </w:t>
       </w:r>
-      <w:hyperlink r:id="rId37">
+      <w:hyperlink r:id="rId35">
         <w:r>
           <w:rPr>
             <w:lang w:val="en_US" w:bidi="en_US"/>
@@ -3281,7 +3238,7 @@
         </w:rPr>
         <w:t xml:space="preserve">, the </w:t>
       </w:r>
-      <w:hyperlink r:id="rId55">
+      <w:hyperlink r:id="rId53">
         <w:r>
           <w:rPr>
             <w:lang w:val="en_US" w:bidi="en_US"/>
@@ -3299,7 +3256,7 @@
         </w:rPr>
         <w:t xml:space="preserve"> anointed the objects in the tabernacle to dedicate them to God. These objects were now sacred, or holy, and would be used only for special service of </w:t>
       </w:r>
-      <w:hyperlink r:id="rId23">
+      <w:hyperlink r:id="rId21">
         <w:r>
           <w:rPr>
             <w:lang w:val="en_US" w:bidi="en_US"/>
@@ -3375,7 +3332,7 @@
           <w:lang w:val="en_US" w:bidi="en_US"/>
         </w:rPr>
       </w:r>
-      <w:hyperlink r:id="rId68">
+      <w:hyperlink r:id="rId66">
         <w:r>
           <w:rPr>
             <w:lang w:val="en_US" w:bidi="en_US"/>
@@ -3441,7 +3398,7 @@
         </w:rPr>
         <w:t xml:space="preserve">In the </w:t>
       </w:r>
-      <w:hyperlink r:id="rId57">
+      <w:hyperlink r:id="rId55">
         <w:r>
           <w:rPr>
             <w:lang w:val="en_US" w:bidi="en_US"/>
@@ -3459,7 +3416,7 @@
         </w:rPr>
         <w:t xml:space="preserve">, Jesus chooses 12 </w:t>
       </w:r>
-      <w:hyperlink r:id="rId69">
+      <w:hyperlink r:id="rId67">
         <w:r>
           <w:rPr>
             <w:lang w:val="en_US" w:bidi="en_US"/>
@@ -3544,7 +3501,7 @@
         </w:rPr>
         <w:t xml:space="preserve"> is someone who has received a special </w:t>
       </w:r>
-      <w:hyperlink r:id="rId44">
+      <w:hyperlink r:id="rId42">
         <w:r>
           <w:rPr>
             <w:lang w:val="en_US" w:bidi="en_US"/>
@@ -3648,7 +3605,7 @@
         </w:rPr>
         <w:t xml:space="preserve">An apostle has authority in the </w:t>
       </w:r>
-      <w:hyperlink r:id="rId70">
+      <w:hyperlink r:id="rId68">
         <w:r>
           <w:rPr>
             <w:lang w:val="en_US" w:bidi="en_US"/>
@@ -3666,7 +3623,7 @@
         </w:rPr>
         <w:t xml:space="preserve">. God had given the apostles the authority to make decisions about spiritual matters. They are the representatives of Jesus in the church. God had also given them power to do </w:t>
       </w:r>
-      <w:hyperlink r:id="rId71">
+      <w:hyperlink r:id="rId69">
         <w:r>
           <w:rPr>
             <w:lang w:val="en_US" w:bidi="en_US"/>
@@ -3742,7 +3699,7 @@
           <w:lang w:val="en_US" w:bidi="en_US"/>
         </w:rPr>
       </w:r>
-      <w:hyperlink r:id="rId72">
+      <w:hyperlink r:id="rId70">
         <w:r>
           <w:rPr>
             <w:lang w:val="en_US" w:bidi="en_US"/>
@@ -3821,7 +3778,7 @@
         </w:rPr>
         <w:t xml:space="preserve"> has the right and the power to make decisions and judgments. The highest authority belongs to God. God can give authority to other people to make decisions or judgments on his behalf. God will often show that he has given authority to people by also giving them power to do </w:t>
       </w:r>
-      <w:hyperlink r:id="rId71">
+      <w:hyperlink r:id="rId69">
         <w:r>
           <w:rPr>
             <w:lang w:val="en_US" w:bidi="en_US"/>
@@ -3853,7 +3810,7 @@
         </w:rPr>
         <w:t xml:space="preserve">Jesus has authority because he is the </w:t>
       </w:r>
-      <w:hyperlink r:id="rId52">
+      <w:hyperlink r:id="rId50">
         <w:r>
           <w:rPr>
             <w:lang w:val="en_US" w:bidi="en_US"/>
@@ -3885,7 +3842,7 @@
         </w:rPr>
         <w:t xml:space="preserve">The </w:t>
       </w:r>
-      <w:hyperlink r:id="rId60">
+      <w:hyperlink r:id="rId58">
         <w:r>
           <w:rPr>
             <w:lang w:val="en_US" w:bidi="en_US"/>
@@ -3903,7 +3860,7 @@
         </w:rPr>
         <w:t xml:space="preserve"> had authority in the </w:t>
       </w:r>
-      <w:hyperlink r:id="rId70">
+      <w:hyperlink r:id="rId68">
         <w:r>
           <w:rPr>
             <w:lang w:val="en_US" w:bidi="en_US"/>
@@ -3993,7 +3950,7 @@
           <w:lang w:val="en_US" w:bidi="en_US"/>
         </w:rPr>
       </w:r>
-      <w:hyperlink r:id="rId73">
+      <w:hyperlink r:id="rId71">
         <w:r>
           <w:rPr>
             <w:lang w:val="en_US" w:bidi="en_US"/>

</xml_diff>